<commit_message>
feat: Appendix B (extended validation) + §8 Limitations 7/8 + reproduce-all
Five new reproducible scripts and outputs:
- dump_per_discipline_accuracy (uniform 1.0000 across 7 disciplines)
- extend_recall_at_k (R@1..10; Enhanced saturates at 0.8621 from K=3)
- measure_pipeline_latency (deterministic stack ~1.2 ms; Qwen 4B gen ~42 s)
- dump_retrieval_failures (7/50, 6/7 paraphrase_too_loose)
- reproduce_all (13/13 scripts pass end-to-end on clean run)

Manuscript v3.1 -> v3.2:
- §3 latency sentence
- §6.5 R@K saturation paragraph
- new Appendix B (B.1-B.5)
- §8 Limitation 7 (independent expert validation as future work)
- §8 Limitation 8 (per-discipline accuracy = self-consistency, not external fidelity)

Response letter EN + KO supplements at R1.3, R2.3, R1.5.

All numbers traced to outputs/*.md from `python scripts/reproduce_all.py`.

Co-Authored-By: Claude Opus 4.7 (1M context) <noreply@anthropic.com>
</commit_message>
<xml_diff>
--- a/docs/publication/submissions/jlp_revision_2026-05-08/RESPONSE_TO_REVIEWERS_KO_v2.docx
+++ b/docs/publication/submissions/jlp_revision_2026-05-08/RESPONSE_TO_REVIEWERS_KO_v2.docx
@@ -1814,6 +1814,36 @@
         <w:t xml:space="preserve">의 §6.1 Table 2 + §6.3 + §6.5 Table 6b.</w:t>
       </w:r>
     </w:p>
+    <w:p>
+      <w:pPr>
+        <w:pStyle w:val="BodyText"/>
+      </w:pPr>
+      <w:r>
+        <w:rPr>
+          <w:i/>
+          <w:iCs/>
+        </w:rPr>
+        <w:t xml:space="preserve">후기 보강 (개정 이후):</w:t>
+      </w:r>
+      <w:r>
+        <w:t xml:space="preserve"> </w:t>
+      </w:r>
+      <w:r>
+        <w:t xml:space="preserve">Appendix B.1은</w:t>
+      </w:r>
+      <w:r>
+        <w:t xml:space="preserve"> </w:t>
+      </w:r>
+      <w:r>
+        <w:rPr>
+          <w:rStyle w:val="VerbatimChar"/>
+        </w:rPr>
+        <w:t xml:space="preserve">outputs/per_discipline_accuracy.md</w:t>
+      </w:r>
+      <w:r>
+        <w:t xml:space="preserve">에서 학제별 계산 정확도를 그대로 보고합니다 — piping 50/50, vessel 30/30, rotating 30/30, electrical 30/30, instrumentation 30/30, steel 25/25, civil 25/25 — 모두 1.0000이며 red-flag precision과 recall도 모든 학제에서 1.0000입니다. 이 균일한 정확도가 외부 ground-truth fidelity가 아닌 self-consistency를 측정한다는 caveat을 §8 Limitation 8로 명시적으로 표면화하여 over-read를 방지합니다.</w:t>
+      </w:r>
+    </w:p>
     <w:bookmarkEnd w:id="12"/>
     <w:bookmarkStart w:id="13" w:name="X1c18f32351f3c28fee897b8fcd871a861c1aac8"/>
     <w:p>
@@ -3011,6 +3041,176 @@
       </w:r>
       <w:r>
         <w:t xml:space="preserve">의 §8 Limitations 1 및 5.</w:t>
+      </w:r>
+    </w:p>
+    <w:p>
+      <w:pPr>
+        <w:pStyle w:val="BodyText"/>
+      </w:pPr>
+      <w:r>
+        <w:rPr>
+          <w:b/>
+          <w:bCs/>
+        </w:rPr>
+        <w:t xml:space="preserve">보충 (실플랜트 검증, 본 개정에서 추가).</w:t>
+      </w:r>
+      <w:r>
+        <w:t xml:space="preserve"> </w:t>
+      </w:r>
+      <w:r>
+        <w:t xml:space="preserve">합성 데이터만에 의존한다는 우려를 프레이밍 논리뿐 아니라 양성적 증거로도 다루기 위해, 원고에</w:t>
+      </w:r>
+      <w:r>
+        <w:t xml:space="preserve"> </w:t>
+      </w:r>
+      <w:r>
+        <w:rPr>
+          <w:b/>
+          <w:bCs/>
+        </w:rPr>
+        <w:t xml:space="preserve">Appendix A — Real-Plant Data-Sheet Validation (VES-REAL-001)</w:t>
+      </w:r>
+      <w:r>
+        <w:t xml:space="preserve"> </w:t>
+      </w:r>
+      <w:r>
+        <w:t xml:space="preserve">을 추가하였습니다. VES-REAL-001은 가동 중인 석유화학 프로젝트에서 가져온 익명화된 저온 플레어 KO 드럼(SA-240 304/304L, 0.343 MPa(g) + 완전진공, 190 °C / -190 °C, ID 5,000 mm, T-T 20,400 mm)이며, 발주처/시공사/라이선서/인명/위치/문서 ID 식별자는 모두 사전에 제거되었습니다. 미수정 파이프라인 실행 결과 +190 °C 측에서 결정론적 UG-27 지배 두께</w:t>
+      </w:r>
+      <w:r>
+        <w:t xml:space="preserve"> </w:t>
+      </w:r>
+      <w:r>
+        <w:rPr>
+          <w:b/>
+          <w:bCs/>
+        </w:rPr>
+        <w:t xml:space="preserve">7.237 mm</w:t>
+      </w:r>
+      <w:r>
+        <w:t xml:space="preserve"> </w:t>
+      </w:r>
+      <w:r>
+        <w:t xml:space="preserve">(엔진 신뢰도</w:t>
+      </w:r>
+      <w:r>
+        <w:t xml:space="preserve"> </w:t>
+      </w:r>
+      <w:r>
+        <w:rPr>
+          <w:rStyle w:val="VerbatimChar"/>
+        </w:rPr>
+        <w:t xml:space="preserve">medium</w:t>
+      </w:r>
+      <w:r>
+        <w:t xml:space="preserve">, red flag 없음)가 산출되고, 명세 충실 쿼리에 대한 KOSHA RAG 검색은 top-10에서</w:t>
+      </w:r>
+      <w:r>
+        <w:t xml:space="preserve"> </w:t>
+      </w:r>
+      <w:r>
+        <w:rPr>
+          <w:b/>
+          <w:bCs/>
+        </w:rPr>
+        <w:t xml:space="preserve">mandatory law_article 2건 + KOSHA 기술지침 8건</w:t>
+      </w:r>
+      <w:r>
+        <w:t xml:space="preserve">을 반환합니다(top-1 guidance:</w:t>
+      </w:r>
+      <w:r>
+        <w:t xml:space="preserve"> </w:t>
+      </w:r>
+      <w:r>
+        <w:rPr>
+          <w:rStyle w:val="VerbatimChar"/>
+        </w:rPr>
+        <w:t xml:space="preserve">M-111-2015</w:t>
+      </w:r>
+      <w:r>
+        <w:t xml:space="preserve"> </w:t>
+      </w:r>
+      <w:r>
+        <w:t xml:space="preserve">압력용기의 용접설계에 관한 기술지침; rank-2 mandatory: 안전검사 고시 제9조). 좁은 한국어 용어 프로브는 추가로</w:t>
+      </w:r>
+      <w:r>
+        <w:t xml:space="preserve"> </w:t>
+      </w:r>
+      <w:r>
+        <w:rPr>
+          <w:b/>
+          <w:bCs/>
+        </w:rPr>
+        <w:t xml:space="preserve">산업안전보건기준에 관한 규칙 제266조</w:t>
+      </w:r>
+      <w:r>
+        <w:t xml:space="preserve"> </w:t>
+      </w:r>
+      <w:r>
+        <w:t xml:space="preserve">(플레어·릴리프 라인 차단밸브 설치 금지)를 rank 5에서 표면화합니다. 전체 증거는</w:t>
+      </w:r>
+      <w:r>
+        <w:t xml:space="preserve"> </w:t>
+      </w:r>
+      <w:r>
+        <w:rPr>
+          <w:rStyle w:val="VerbatimChar"/>
+        </w:rPr>
+        <w:t xml:space="preserve">scripts/run_real_case_ves001_rag.py</w:t>
+      </w:r>
+      <w:r>
+        <w:t xml:space="preserve"> </w:t>
+      </w:r>
+      <w:r>
+        <w:t xml:space="preserve">→</w:t>
+      </w:r>
+      <w:r>
+        <w:t xml:space="preserve"> </w:t>
+      </w:r>
+      <w:r>
+        <w:rPr>
+          <w:rStyle w:val="VerbatimChar"/>
+        </w:rPr>
+        <w:t xml:space="preserve">outputs/real_case_ves001_rag.{json,md}</w:t>
+      </w:r>
+      <w:r>
+        <w:t xml:space="preserve"> </w:t>
+      </w:r>
+      <w:r>
+        <w:t xml:space="preserve">로 재현 가능합니다. 따라서 본 개정에서 우리는 본 프레임워크에 대해</w:t>
+      </w:r>
+      <w:r>
+        <w:t xml:space="preserve"> </w:t>
+      </w:r>
+      <w:r>
+        <w:rPr>
+          <w:b/>
+          <w:bCs/>
+        </w:rPr>
+        <w:t xml:space="preserve">합성 + 실데이터 이중 검증(synthetic + real-data dual validation)</w:t>
+      </w:r>
+      <w:r>
+        <w:t xml:space="preserve"> </w:t>
+      </w:r>
+      <w:r>
+        <w:t xml:space="preserve">을 주장할 수 있게 되었습니다. 실제 실패 결과에 대한 예측 검증은 여전히 미해결 향후 과제 항목으로 남습니다(§8 Limitation 1).</w:t>
+      </w:r>
+    </w:p>
+    <w:p>
+      <w:pPr>
+        <w:pStyle w:val="BodyText"/>
+      </w:pPr>
+      <w:r>
+        <w:rPr>
+          <w:i/>
+          <w:iCs/>
+        </w:rPr>
+        <w:t xml:space="preserve">독립 전문가 검증에 관하여:</w:t>
+      </w:r>
+      <w:r>
+        <w:t xml:space="preserve"> </w:t>
+      </w:r>
+      <w:r>
+        <w:t xml:space="preserve">주 저자는 12년 이상의 석유화학 EPC 경력을 가진 공정 플랜트 엔지니어이며, 계산 엔진 규칙과 케이스 구성은 해당 도메인 실무를 인코딩한 것입니다. 이를 독립 검증으로 주장하지 않으며 — 그것은 분리된 전문가 패널을 요구합니다 — §8 Limitation 7로 명시하고 외부 KOSHA PSM 감사관 대비 전향적 향후 연구 항목으로 문서화합니다.</w:t>
       </w:r>
     </w:p>
     <w:p>
@@ -4764,6 +4964,48 @@
       </w:r>
       <w:r>
         <w:t xml:space="preserve">; §8 Limitations 1 및 3.</w:t>
+      </w:r>
+    </w:p>
+    <w:p>
+      <w:pPr>
+        <w:pStyle w:val="BodyText"/>
+      </w:pPr>
+      <w:r>
+        <w:rPr>
+          <w:i/>
+          <w:iCs/>
+        </w:rPr>
+        <w:t xml:space="preserve">후기 보강 (개정 이후):</w:t>
+      </w:r>
+      <w:r>
+        <w:t xml:space="preserve"> </w:t>
+      </w:r>
+      <w:r>
+        <w:t xml:space="preserve">recall 분석을 K=10까지 확장했습니다 (Appendix B.2,</w:t>
+      </w:r>
+      <w:r>
+        <w:t xml:space="preserve"> </w:t>
+      </w:r>
+      <w:r>
+        <w:rPr>
+          <w:rStyle w:val="VerbatimChar"/>
+        </w:rPr>
+        <w:t xml:space="preserve">outputs/rag_retrieval_extended.md</w:t>
+      </w:r>
+      <w:r>
+        <w:t xml:space="preserve">). Enhanced FTS 곡선은 K=3부터 0.8621에서 포화하고, Plain FTS 곡선은 K∈{9, 10}에서 0.8012까지 계속 상승합니다; Enhanced − Plain 페어드 차이의 95% 부트스트랩 CI는 K∈{1, 2}에서만 0을 배제합니다. 또한 검색 실패 인벤토리 (Appendix B.4)를 공개하여 K=5 miss 모두를 두 진단 카테고리 중 하나로 태그합니다 — 7건 중 6건이</w:t>
+      </w:r>
+      <w:r>
+        <w:t xml:space="preserve"> </w:t>
+      </w:r>
+      <w:r>
+        <w:rPr>
+          <w:rStyle w:val="VerbatimChar"/>
+        </w:rPr>
+        <w:t xml:space="preserve">paraphrase_too_loose</w:t>
+      </w:r>
+      <w:r>
+        <w:t xml:space="preserve">에 해당 — 잔존하는 약점을 숨기지 않고 검사 가능하게 만들었습니다.</w:t>
       </w:r>
     </w:p>
     <w:bookmarkEnd w:id="18"/>

</xml_diff>